<commit_message>
docs: perfected Word document with zero double text and crisp high-res embedded diagrams
</commit_message>
<xml_diff>
--- a/frontend/public/TraceIQ_Master_Leadership_and_QA_Handbook.docx
+++ b/frontend/public/TraceIQ_Master_Leadership_and_QA_Handbook.docx
@@ -22,15 +22,15 @@
           <w:tcPr>
             <w:shd w:fill="0F172A" w:val="clear"/>
             <w:tcMar>
-              <w:top w:type="dxa" w:w="300"/>
-              <w:left w:type="dxa" w:w="300"/>
-              <w:bottom w:type="dxa" w:w="300"/>
-              <w:right w:type="dxa" w:w="300"/>
+              <w:top w:type="dxa" w:w="280"/>
+              <w:left w:type="dxa" w:w="280"/>
+              <w:bottom w:type="dxa" w:w="280"/>
+              <w:right w:type="dxa" w:w="280"/>
             </w:tcMar>
           </w:tcPr>
           <w:p>
             <w:pPr>
-              <w:spacing w:after="80"/>
+              <w:spacing w:after="60"/>
             </w:pPr>
             <w:r>
               <w:rPr>
@@ -47,8 +47,8 @@
               <w:rPr>
                 <w:rFonts w:ascii="Calibri" w:cs="Calibri" w:eastAsia="Calibri" w:hAnsi="Calibri"/>
                 <w:color w:val="60A5FA"/>
-                <w:sz w:val="24"/>
-                <w:szCs w:val="24"/>
+                <w:sz w:val="22"/>
+                <w:szCs w:val="22"/>
               </w:rPr>
               <w:t xml:space="preserve">  |  Telecom Protocol Intelligence</w:t>
             </w:r>
@@ -85,13 +85,13 @@
     </w:tbl>
     <w:p>
       <w:pPr>
-        <w:spacing w:after="200"/>
+        <w:spacing w:after="180"/>
       </w:pPr>
     </w:p>
     <w:p>
       <w:pPr>
         <w:pStyle w:val="Heading1"/>
-        <w:spacing w:after="140" w:before="360"/>
+        <w:spacing w:after="120" w:before="320"/>
       </w:pPr>
       <w:r>
         <w:rPr>
@@ -107,7 +107,7 @@
     </w:p>
     <w:p>
       <w:pPr>
-        <w:spacing w:after="140" w:line="276"/>
+        <w:spacing w:after="120" w:line="276"/>
       </w:pPr>
       <w:r>
         <w:rPr>
@@ -510,13 +510,76 @@
     </w:tbl>
     <w:p>
       <w:pPr>
-        <w:spacing w:after="200"/>
-      </w:pPr>
+        <w:spacing w:after="180"/>
+      </w:pPr>
+    </w:p>
+    <w:p>
+      <w:pPr>
+        <w:pStyle w:val="Heading2"/>
+        <w:spacing w:after="120" w:before="320"/>
+      </w:pPr>
+      <w:r>
+        <w:rPr>
+          <w:rFonts w:ascii="Calibri" w:cs="Calibri" w:eastAsia="Calibri" w:hAnsi="Calibri"/>
+          <w:b/>
+          <w:bCs/>
+          <w:color w:val="0F172A"/>
+          <w:sz w:val="24"/>
+          <w:szCs w:val="24"/>
+        </w:rPr>
+        <w:t xml:space="preserve">End-to-End System Workflow Architecture</w:t>
+      </w:r>
+    </w:p>
+    <w:p>
+      <w:pPr>
+        <w:spacing w:after="220"/>
+        <w:jc w:val="center"/>
+      </w:pPr>
+      <w:r>
+        <w:drawing>
+          <wp:inline distT="0" distB="0" distL="0" distR="0">
+            <wp:extent cx="5905500" cy="2066925"/>
+            <wp:effectExtent t="0" r="0" b="0" l="0"/>
+            <wp:docPr id="1" name="" descr="" title=""/>
+            <wp:cNvGraphicFramePr>
+              <a:graphicFrameLocks xmlns:a="http://schemas.openxmlformats.org/drawingml/2006/main" noChangeAspect="1"/>
+            </wp:cNvGraphicFramePr>
+            <a:graphic xmlns:a="http://schemas.openxmlformats.org/drawingml/2006/main">
+              <a:graphicData uri="http://schemas.openxmlformats.org/drawingml/2006/picture">
+                <pic:pic xmlns:pic="http://schemas.openxmlformats.org/drawingml/2006/picture">
+                  <pic:nvPicPr>
+                    <pic:cNvPr id="0" name="" descr=""/>
+                    <pic:cNvPicPr>
+                      <a:picLocks noChangeAspect="1" noChangeArrowheads="1"/>
+                    </pic:cNvPicPr>
+                  </pic:nvPicPr>
+                  <pic:blipFill>
+                    <a:blip r:embed="rId7" cstate="none"/>
+                    <a:srcRect/>
+                    <a:stretch>
+                      <a:fillRect/>
+                    </a:stretch>
+                  </pic:blipFill>
+                  <pic:spPr bwMode="auto">
+                    <a:xfrm>
+                      <a:off x="0" y="0"/>
+                      <a:ext cx="5905500" cy="2066925"/>
+                    </a:xfrm>
+                    <a:prstGeom prst="rect">
+                      <a:avLst/>
+                    </a:prstGeom>
+                  </pic:spPr>
+                </pic:pic>
+              </a:graphicData>
+            </a:graphic>
+          </wp:inline>
+        </w:drawing>
+      </w:r>
     </w:p>
     <w:p>
       <w:pPr>
         <w:pStyle w:val="Heading1"/>
-        <w:spacing w:after="140" w:before="360"/>
+        <w:spacing w:after="120" w:before="320"/>
       </w:pPr>
       <w:r>
         <w:rPr>
@@ -532,7 +595,7 @@
     </w:p>
     <w:p>
       <w:pPr>
-        <w:spacing w:after="140" w:line="276"/>
+        <w:spacing w:after="120" w:line="276"/>
       </w:pPr>
       <w:r>
         <w:rPr>
@@ -564,15 +627,15 @@
           <w:tcPr>
             <w:shd w:fill="F8FAFC" w:val="clear"/>
             <w:tcMar>
-              <w:top w:type="dxa" w:w="160"/>
-              <w:left w:type="dxa" w:w="200"/>
-              <w:bottom w:type="dxa" w:w="160"/>
-              <w:right w:type="dxa" w:w="180"/>
+              <w:top w:type="dxa" w:w="140"/>
+              <w:left w:type="dxa" w:w="180"/>
+              <w:bottom w:type="dxa" w:w="140"/>
+              <w:right w:type="dxa" w:w="160"/>
             </w:tcMar>
           </w:tcPr>
           <w:p>
             <w:pPr>
-              <w:spacing w:after="100"/>
+              <w:spacing w:after="80"/>
             </w:pPr>
             <w:r>
               <w:rPr>
@@ -588,7 +651,7 @@
           </w:p>
           <w:p>
             <w:pPr>
-              <w:spacing w:after="80" w:line="276"/>
+              <w:spacing w:after="60" w:line="276"/>
             </w:pPr>
             <w:r>
               <w:rPr>
@@ -604,7 +667,7 @@
           </w:p>
           <w:p>
             <w:pPr>
-              <w:spacing w:after="80" w:line="276"/>
+              <w:spacing w:after="60" w:line="276"/>
             </w:pPr>
             <w:r>
               <w:rPr>
@@ -620,7 +683,7 @@
           </w:p>
           <w:p>
             <w:pPr>
-              <w:spacing w:after="80" w:line="276"/>
+              <w:spacing w:after="60" w:line="276"/>
             </w:pPr>
             <w:r>
               <w:rPr>
@@ -636,7 +699,7 @@
           </w:p>
           <w:p>
             <w:pPr>
-              <w:spacing w:after="80" w:line="276"/>
+              <w:spacing w:after="60" w:line="276"/>
             </w:pPr>
             <w:r>
               <w:rPr>
@@ -652,7 +715,7 @@
           </w:p>
           <w:p>
             <w:pPr>
-              <w:spacing w:after="80" w:line="276"/>
+              <w:spacing w:after="60" w:line="276"/>
             </w:pPr>
             <w:r>
               <w:rPr>
@@ -668,7 +731,7 @@
           </w:p>
           <w:p>
             <w:pPr>
-              <w:spacing w:after="80" w:line="276"/>
+              <w:spacing w:after="60" w:line="276"/>
             </w:pPr>
             <w:r>
               <w:rPr>
@@ -684,7 +747,7 @@
           </w:p>
           <w:p>
             <w:pPr>
-              <w:spacing w:after="80" w:line="276"/>
+              <w:spacing w:after="60" w:line="276"/>
             </w:pPr>
             <w:r>
               <w:rPr>
@@ -700,7 +763,7 @@
           </w:p>
           <w:p>
             <w:pPr>
-              <w:spacing w:after="80" w:line="276"/>
+              <w:spacing w:after="60" w:line="276"/>
             </w:pPr>
             <w:r>
               <w:rPr>
@@ -716,7 +779,7 @@
           </w:p>
           <w:p>
             <w:pPr>
-              <w:spacing w:after="80" w:line="276"/>
+              <w:spacing w:after="60" w:line="276"/>
             </w:pPr>
             <w:r>
               <w:rPr>
@@ -735,13 +798,13 @@
     </w:tbl>
     <w:p>
       <w:pPr>
-        <w:spacing w:after="240"/>
+        <w:spacing w:after="220"/>
       </w:pPr>
     </w:p>
     <w:p>
       <w:pPr>
         <w:pStyle w:val="Heading1"/>
-        <w:spacing w:after="140" w:before="360"/>
+        <w:spacing w:after="120" w:before="320"/>
       </w:pPr>
       <w:r>
         <w:rPr>
@@ -907,13 +970,76 @@
     </w:p>
     <w:p>
       <w:pPr>
-        <w:spacing w:after="240"/>
-      </w:pPr>
+        <w:spacing w:after="220"/>
+      </w:pPr>
+    </w:p>
+    <w:p>
+      <w:pPr>
+        <w:pStyle w:val="Heading2"/>
+        <w:spacing w:after="120" w:before="320"/>
+      </w:pPr>
+      <w:r>
+        <w:rPr>
+          <w:rFonts w:ascii="Calibri" w:cs="Calibri" w:eastAsia="Calibri" w:hAnsi="Calibri"/>
+          <w:b/>
+          <w:bCs/>
+          <w:color w:val="0F172A"/>
+          <w:sz w:val="24"/>
+          <w:szCs w:val="24"/>
+        </w:rPr>
+        <w:t xml:space="preserve">3-Tier Telecom AI Reasoning &amp; Context-Grounding Architecture</w:t>
+      </w:r>
+    </w:p>
+    <w:p>
+      <w:pPr>
+        <w:spacing w:after="220"/>
+        <w:jc w:val="center"/>
+      </w:pPr>
+      <w:r>
+        <w:drawing>
+          <wp:inline distT="0" distB="0" distL="0" distR="0">
+            <wp:extent cx="5905500" cy="1476375"/>
+            <wp:effectExtent t="0" r="0" b="0" l="0"/>
+            <wp:docPr id="1" name="" descr="" title=""/>
+            <wp:cNvGraphicFramePr>
+              <a:graphicFrameLocks xmlns:a="http://schemas.openxmlformats.org/drawingml/2006/main" noChangeAspect="1"/>
+            </wp:cNvGraphicFramePr>
+            <a:graphic xmlns:a="http://schemas.openxmlformats.org/drawingml/2006/main">
+              <a:graphicData uri="http://schemas.openxmlformats.org/drawingml/2006/picture">
+                <pic:pic xmlns:pic="http://schemas.openxmlformats.org/drawingml/2006/picture">
+                  <pic:nvPicPr>
+                    <pic:cNvPr id="0" name="" descr=""/>
+                    <pic:cNvPicPr>
+                      <a:picLocks noChangeAspect="1" noChangeArrowheads="1"/>
+                    </pic:cNvPicPr>
+                  </pic:nvPicPr>
+                  <pic:blipFill>
+                    <a:blip r:embed="rId8" cstate="none"/>
+                    <a:srcRect/>
+                    <a:stretch>
+                      <a:fillRect/>
+                    </a:stretch>
+                  </pic:blipFill>
+                  <pic:spPr bwMode="auto">
+                    <a:xfrm>
+                      <a:off x="0" y="0"/>
+                      <a:ext cx="5905500" cy="1476375"/>
+                    </a:xfrm>
+                    <a:prstGeom prst="rect">
+                      <a:avLst/>
+                    </a:prstGeom>
+                  </pic:spPr>
+                </pic:pic>
+              </a:graphicData>
+            </a:graphic>
+          </wp:inline>
+        </w:drawing>
+      </w:r>
     </w:p>
     <w:p>
       <w:pPr>
         <w:pStyle w:val="Heading1"/>
-        <w:spacing w:after="140" w:before="360"/>
+        <w:spacing w:after="120" w:before="320"/>
       </w:pPr>
       <w:r>
         <w:rPr>
@@ -929,7 +1055,7 @@
     </w:p>
     <w:p>
       <w:pPr>
-        <w:spacing w:after="140" w:line="276"/>
+        <w:spacing w:after="120" w:line="276"/>
       </w:pPr>
       <w:r>
         <w:rPr>
@@ -1093,13 +1219,13 @@
     </w:p>
     <w:p>
       <w:pPr>
-        <w:spacing w:after="240"/>
+        <w:spacing w:after="220"/>
       </w:pPr>
     </w:p>
     <w:p>
       <w:pPr>
         <w:pStyle w:val="Heading1"/>
-        <w:spacing w:after="140" w:before="360"/>
+        <w:spacing w:after="120" w:before="320"/>
       </w:pPr>
       <w:r>
         <w:rPr>
@@ -1115,7 +1241,7 @@
     </w:p>
     <w:p>
       <w:pPr>
-        <w:spacing w:after="100" w:before="280"/>
+        <w:spacing w:after="100" w:before="260"/>
       </w:pPr>
       <w:r>
         <w:rPr>
@@ -1160,15 +1286,15 @@
           <w:tcPr>
             <w:shd w:fill="F0FDF4" w:val="clear"/>
             <w:tcMar>
-              <w:top w:type="dxa" w:w="160"/>
-              <w:left w:type="dxa" w:w="200"/>
-              <w:bottom w:type="dxa" w:w="160"/>
-              <w:right w:type="dxa" w:w="180"/>
+              <w:top w:type="dxa" w:w="140"/>
+              <w:left w:type="dxa" w:w="180"/>
+              <w:bottom w:type="dxa" w:w="140"/>
+              <w:right w:type="dxa" w:w="160"/>
             </w:tcMar>
           </w:tcPr>
           <w:p>
             <w:pPr>
-              <w:spacing w:after="100"/>
+              <w:spacing w:after="80"/>
             </w:pPr>
             <w:r>
               <w:rPr>
@@ -1179,12 +1305,12 @@
                 <w:sz w:val="22"/>
                 <w:szCs w:val="22"/>
               </w:rPr>
-              <w:t xml:space="preserve">🗣️ Layman Answer (For Managers &amp; Leadership):</w:t>
-            </w:r>
-          </w:p>
-          <w:p>
-            <w:pPr>
-              <w:spacing w:after="80" w:line="276"/>
+              <w:t xml:space="preserve">🗣️ Recommended Layman Answer:</w:t>
+            </w:r>
+          </w:p>
+          <w:p>
+            <w:pPr>
+              <w:spacing w:after="60" w:line="276"/>
             </w:pPr>
             <w:r>
               <w:rPr>
@@ -1195,7 +1321,23 @@
                 <w:sz w:val="21"/>
                 <w:szCs w:val="21"/>
               </w:rPr>
-              <w:t xml:space="preserve">We built the intelligence using a Hybrid Telecom Knowledge Engine. Instead of treating telecom packets like generic text, we codified 3GPP specifications and IETF RFC standards (for 5G Core, 4G EPC, IMS, O-RAN, Diameter, and SS7) directly into the platform’s reasoning logic. When a user loads a capture or asks a question, TraceIQ uses a Domain Classifier that inspects Layer 4 transport ports (5060, 21336, 3868), Layer 7 headers (SIP, SDP, MSML, GTP), and transaction flow to immediately recognize the telecom domain and respond with domain-specific intelligence.</w:t>
+              <w:t xml:space="preserve">We built the intelligence using a Hybrid Telecom Knowledge Engine. Instead of treating telecom packets like generic text, we codified 3GPP specifications and IETF RFC standards (for 5G Core, 4G EPC, IMS, O-RAN, Diameter, and SS7) directly into the platform’s reasoning logic.</w:t>
+            </w:r>
+          </w:p>
+          <w:p>
+            <w:pPr>
+              <w:spacing w:after="60" w:line="276"/>
+            </w:pPr>
+            <w:r>
+              <w:rPr>
+                <w:rFonts w:ascii="Calibri" w:cs="Calibri" w:eastAsia="Calibri" w:hAnsi="Calibri"/>
+                <w:i w:val="false"/>
+                <w:iCs w:val="false"/>
+                <w:color w:val="1E293B"/>
+                <w:sz w:val="21"/>
+                <w:szCs w:val="21"/>
+              </w:rPr>
+              <w:t xml:space="preserve">When a user loads a capture or asks a question, TraceIQ uses a Domain Classifier that inspects Layer 4 transport ports (5060, 21336, 3868), Layer 7 headers (SIP, SDP, MSML, GTP), and transaction flow to immediately recognize the telecom domain and respond with domain-specific intelligence.</w:t>
             </w:r>
           </w:p>
         </w:tc>
@@ -1226,15 +1368,15 @@
           <w:tcPr>
             <w:shd w:fill="EFF6FF" w:val="clear"/>
             <w:tcMar>
-              <w:top w:type="dxa" w:w="160"/>
-              <w:left w:type="dxa" w:w="200"/>
-              <w:bottom w:type="dxa" w:w="160"/>
-              <w:right w:type="dxa" w:w="180"/>
+              <w:top w:type="dxa" w:w="140"/>
+              <w:left w:type="dxa" w:w="180"/>
+              <w:bottom w:type="dxa" w:w="140"/>
+              <w:right w:type="dxa" w:w="160"/>
             </w:tcMar>
           </w:tcPr>
           <w:p>
             <w:pPr>
-              <w:spacing w:after="100"/>
+              <w:spacing w:after="80"/>
             </w:pPr>
             <w:r>
               <w:rPr>
@@ -1250,7 +1392,7 @@
           </w:p>
           <w:p>
             <w:pPr>
-              <w:spacing w:after="80" w:line="276"/>
+              <w:spacing w:after="60" w:line="276"/>
             </w:pPr>
             <w:r>
               <w:rPr>
@@ -1261,8 +1403,23 @@
                 <w:sz w:val="21"/>
                 <w:szCs w:val="21"/>
               </w:rPr>
-              <w:t xml:space="preserve">• Standards Codified: 3GPP TS 24.229 (IMS SIP), 3GPP TS 29.274 (GTPv2), 3GPP TS 38.413 (NGAP), RFC 3261 (SIP), and RFC 4566 (SDP).
-• Multi-Layer Fingerprinting: Port 5060 + text -&gt; SIP; &lt;msml&gt; tags -&gt; Media Server IVR; Port 3868 -&gt; Diameter AAA.</w:t>
+              <w:t xml:space="preserve">• Standards Codified: 3GPP TS 24.229 (IMS SIP), 3GPP TS 29.274 (GTPv2), 3GPP TS 38.413 (NGAP), RFC 3261 (SIP), and RFC 4566 (SDP).</w:t>
+            </w:r>
+          </w:p>
+          <w:p>
+            <w:pPr>
+              <w:spacing w:after="60" w:line="276"/>
+            </w:pPr>
+            <w:r>
+              <w:rPr>
+                <w:rFonts w:ascii="Calibri" w:cs="Calibri" w:eastAsia="Calibri" w:hAnsi="Calibri"/>
+                <w:i w:val="false"/>
+                <w:iCs w:val="false"/>
+                <w:color w:val="1E293B"/>
+                <w:sz w:val="21"/>
+                <w:szCs w:val="21"/>
+              </w:rPr>
+              <w:t xml:space="preserve">• Multi-Layer Fingerprinting: Port 5060 + text -&gt; SIP; &lt;msml&gt; tags -&gt; Media Server IVR; Port 3868 -&gt; Diameter AAA.</w:t>
             </w:r>
           </w:p>
         </w:tc>
@@ -1270,12 +1427,12 @@
     </w:tbl>
     <w:p>
       <w:pPr>
-        <w:spacing w:after="120"/>
-      </w:pPr>
-    </w:p>
-    <w:p>
-      <w:pPr>
-        <w:spacing w:after="100" w:before="280"/>
+        <w:spacing w:after="100"/>
+      </w:pPr>
+    </w:p>
+    <w:p>
+      <w:pPr>
+        <w:spacing w:after="100" w:before="260"/>
       </w:pPr>
       <w:r>
         <w:rPr>
@@ -1320,15 +1477,15 @@
           <w:tcPr>
             <w:shd w:fill="F0FDF4" w:val="clear"/>
             <w:tcMar>
-              <w:top w:type="dxa" w:w="160"/>
-              <w:left w:type="dxa" w:w="200"/>
-              <w:bottom w:type="dxa" w:w="160"/>
-              <w:right w:type="dxa" w:w="180"/>
+              <w:top w:type="dxa" w:w="140"/>
+              <w:left w:type="dxa" w:w="180"/>
+              <w:bottom w:type="dxa" w:w="140"/>
+              <w:right w:type="dxa" w:w="160"/>
             </w:tcMar>
           </w:tcPr>
           <w:p>
             <w:pPr>
-              <w:spacing w:after="100"/>
+              <w:spacing w:after="80"/>
             </w:pPr>
             <w:r>
               <w:rPr>
@@ -1339,12 +1496,12 @@
                 <w:sz w:val="22"/>
                 <w:szCs w:val="22"/>
               </w:rPr>
-              <w:t xml:space="preserve">🗣️ Layman Answer (For Managers &amp; Leadership):</w:t>
-            </w:r>
-          </w:p>
-          <w:p>
-            <w:pPr>
-              <w:spacing w:after="80" w:line="276"/>
+              <w:t xml:space="preserve">🗣️ Recommended Layman Answer:</w:t>
+            </w:r>
+          </w:p>
+          <w:p>
+            <w:pPr>
+              <w:spacing w:after="60" w:line="276"/>
             </w:pPr>
             <w:r>
               <w:rPr>
@@ -1355,7 +1512,23 @@
                 <w:sz w:val="21"/>
                 <w:szCs w:val="21"/>
               </w:rPr>
-              <w:t xml:space="preserve">We combined hands-on telecom troubleshooting experience with AI pair-programming: We took official, publicly available IETF RFC standards (RFC 3261, RFC 4566, RFC 3550) and 3GPP specifications (TS 24.229, TS 29.274, TS 38.413). Using AI pair-programming, we extracted and structured standard 3GPP error tables and cause codes into clean TypeScript dictionaries in api.ts, mapping every response code to its RFC definition, real-world telecom context, and actionable engineering fix.</w:t>
+              <w:t xml:space="preserve">We combined hands-on telecom troubleshooting experience with AI pair-programming: We took official, publicly available IETF RFC standards (RFC 3261, RFC 4566, RFC 3550) and 3GPP specifications (TS 24.229, TS 29.274, TS 38.413).</w:t>
+            </w:r>
+          </w:p>
+          <w:p>
+            <w:pPr>
+              <w:spacing w:after="60" w:line="276"/>
+            </w:pPr>
+            <w:r>
+              <w:rPr>
+                <w:rFonts w:ascii="Calibri" w:cs="Calibri" w:eastAsia="Calibri" w:hAnsi="Calibri"/>
+                <w:i w:val="false"/>
+                <w:iCs w:val="false"/>
+                <w:color w:val="1E293B"/>
+                <w:sz w:val="21"/>
+                <w:szCs w:val="21"/>
+              </w:rPr>
+              <w:t xml:space="preserve">Using AI pair-programming, we extracted and structured standard 3GPP error tables and cause codes into clean TypeScript dictionaries in api.ts, mapping every response code to its RFC definition, real-world telecom context, and actionable engineering fix.</w:t>
             </w:r>
           </w:p>
         </w:tc>
@@ -1386,15 +1559,15 @@
           <w:tcPr>
             <w:shd w:fill="EFF6FF" w:val="clear"/>
             <w:tcMar>
-              <w:top w:type="dxa" w:w="160"/>
-              <w:left w:type="dxa" w:w="200"/>
-              <w:bottom w:type="dxa" w:w="160"/>
-              <w:right w:type="dxa" w:w="180"/>
+              <w:top w:type="dxa" w:w="140"/>
+              <w:left w:type="dxa" w:w="180"/>
+              <w:bottom w:type="dxa" w:w="140"/>
+              <w:right w:type="dxa" w:w="160"/>
             </w:tcMar>
           </w:tcPr>
           <w:p>
             <w:pPr>
-              <w:spacing w:after="100"/>
+              <w:spacing w:after="80"/>
             </w:pPr>
             <w:r>
               <w:rPr>
@@ -1410,7 +1583,7 @@
           </w:p>
           <w:p>
             <w:pPr>
-              <w:spacing w:after="80" w:line="276"/>
+              <w:spacing w:after="60" w:line="276"/>
             </w:pPr>
             <w:r>
               <w:rPr>
@@ -1429,12 +1602,12 @@
     </w:tbl>
     <w:p>
       <w:pPr>
-        <w:spacing w:after="120"/>
-      </w:pPr>
-    </w:p>
-    <w:p>
-      <w:pPr>
-        <w:spacing w:after="100" w:before="280"/>
+        <w:spacing w:after="100"/>
+      </w:pPr>
+    </w:p>
+    <w:p>
+      <w:pPr>
+        <w:spacing w:after="100" w:before="260"/>
       </w:pPr>
       <w:r>
         <w:rPr>
@@ -1479,15 +1652,15 @@
           <w:tcPr>
             <w:shd w:fill="F0FDF4" w:val="clear"/>
             <w:tcMar>
-              <w:top w:type="dxa" w:w="160"/>
-              <w:left w:type="dxa" w:w="200"/>
-              <w:bottom w:type="dxa" w:w="160"/>
-              <w:right w:type="dxa" w:w="180"/>
+              <w:top w:type="dxa" w:w="140"/>
+              <w:left w:type="dxa" w:w="180"/>
+              <w:bottom w:type="dxa" w:w="140"/>
+              <w:right w:type="dxa" w:w="160"/>
             </w:tcMar>
           </w:tcPr>
           <w:p>
             <w:pPr>
-              <w:spacing w:after="100"/>
+              <w:spacing w:after="80"/>
             </w:pPr>
             <w:r>
               <w:rPr>
@@ -1498,12 +1671,12 @@
                 <w:sz w:val="22"/>
                 <w:szCs w:val="22"/>
               </w:rPr>
-              <w:t xml:space="preserve">🗣️ Layman Answer (For Managers &amp; Leadership):</w:t>
-            </w:r>
-          </w:p>
-          <w:p>
-            <w:pPr>
-              <w:spacing w:after="80" w:line="276"/>
+              <w:t xml:space="preserve">🗣️ Recommended Layman Answer:</w:t>
+            </w:r>
+          </w:p>
+          <w:p>
+            <w:pPr>
+              <w:spacing w:after="60" w:line="276"/>
             </w:pPr>
             <w:r>
               <w:rPr>
@@ -1514,10 +1687,55 @@
                 <w:sz w:val="21"/>
                 <w:szCs w:val="21"/>
               </w:rPr>
-              <w:t xml:space="preserve">• .ts (TypeScript): JavaScript with built-in safety rules (types) preventing runtime bugs.
-• pcapClientParser.ts: The frontend engine room that decodes raw binary PCAP 0s and 1s locally in the browser.
-• api.ts: Our telecom domain ontology and bridge holding definitions and plain-English translations.
-• Codifying: Translating 500-page 3GPP rulebooks into automated software checks.</w:t>
+              <w:t xml:space="preserve">• .ts (TypeScript): JavaScript with built-in safety rules (types) preventing runtime bugs.</w:t>
+            </w:r>
+          </w:p>
+          <w:p>
+            <w:pPr>
+              <w:spacing w:after="60" w:line="276"/>
+            </w:pPr>
+            <w:r>
+              <w:rPr>
+                <w:rFonts w:ascii="Calibri" w:cs="Calibri" w:eastAsia="Calibri" w:hAnsi="Calibri"/>
+                <w:i w:val="false"/>
+                <w:iCs w:val="false"/>
+                <w:color w:val="1E293B"/>
+                <w:sz w:val="21"/>
+                <w:szCs w:val="21"/>
+              </w:rPr>
+              <w:t xml:space="preserve">• pcapClientParser.ts: The frontend engine room that decodes raw binary PCAP 0s and 1s locally in the browser.</w:t>
+            </w:r>
+          </w:p>
+          <w:p>
+            <w:pPr>
+              <w:spacing w:after="60" w:line="276"/>
+            </w:pPr>
+            <w:r>
+              <w:rPr>
+                <w:rFonts w:ascii="Calibri" w:cs="Calibri" w:eastAsia="Calibri" w:hAnsi="Calibri"/>
+                <w:i w:val="false"/>
+                <w:iCs w:val="false"/>
+                <w:color w:val="1E293B"/>
+                <w:sz w:val="21"/>
+                <w:szCs w:val="21"/>
+              </w:rPr>
+              <w:t xml:space="preserve">• api.ts: Our telecom domain ontology and bridge holding definitions and plain-English translations.</w:t>
+            </w:r>
+          </w:p>
+          <w:p>
+            <w:pPr>
+              <w:spacing w:after="60" w:line="276"/>
+            </w:pPr>
+            <w:r>
+              <w:rPr>
+                <w:rFonts w:ascii="Calibri" w:cs="Calibri" w:eastAsia="Calibri" w:hAnsi="Calibri"/>
+                <w:i w:val="false"/>
+                <w:iCs w:val="false"/>
+                <w:color w:val="1E293B"/>
+                <w:sz w:val="21"/>
+                <w:szCs w:val="21"/>
+              </w:rPr>
+              <w:t xml:space="preserve">• Codifying: Translating 500-page 3GPP rulebooks into automated software checks.</w:t>
             </w:r>
           </w:p>
         </w:tc>
@@ -1525,12 +1743,12 @@
     </w:tbl>
     <w:p>
       <w:pPr>
-        <w:spacing w:after="120"/>
-      </w:pPr>
-    </w:p>
-    <w:p>
-      <w:pPr>
-        <w:spacing w:after="100" w:before="280"/>
+        <w:spacing w:after="100"/>
+      </w:pPr>
+    </w:p>
+    <w:p>
+      <w:pPr>
+        <w:spacing w:after="100" w:before="260"/>
       </w:pPr>
       <w:r>
         <w:rPr>
@@ -1575,15 +1793,15 @@
           <w:tcPr>
             <w:shd w:fill="F0FDF4" w:val="clear"/>
             <w:tcMar>
-              <w:top w:type="dxa" w:w="160"/>
-              <w:left w:type="dxa" w:w="200"/>
-              <w:bottom w:type="dxa" w:w="160"/>
-              <w:right w:type="dxa" w:w="180"/>
+              <w:top w:type="dxa" w:w="140"/>
+              <w:left w:type="dxa" w:w="180"/>
+              <w:bottom w:type="dxa" w:w="140"/>
+              <w:right w:type="dxa" w:w="160"/>
             </w:tcMar>
           </w:tcPr>
           <w:p>
             <w:pPr>
-              <w:spacing w:after="100"/>
+              <w:spacing w:after="80"/>
             </w:pPr>
             <w:r>
               <w:rPr>
@@ -1594,12 +1812,12 @@
                 <w:sz w:val="22"/>
                 <w:szCs w:val="22"/>
               </w:rPr>
-              <w:t xml:space="preserve">🗣️ Layman Answer (For Managers &amp; Leadership):</w:t>
-            </w:r>
-          </w:p>
-          <w:p>
-            <w:pPr>
-              <w:spacing w:after="80" w:line="276"/>
+              <w:t xml:space="preserve">🗣️ Recommended Layman Answer:</w:t>
+            </w:r>
+          </w:p>
+          <w:p>
+            <w:pPr>
+              <w:spacing w:after="60" w:line="276"/>
             </w:pPr>
             <w:r>
               <w:rPr>
@@ -1610,10 +1828,55 @@
                 <w:sz w:val="21"/>
                 <w:szCs w:val="21"/>
               </w:rPr>
-              <w:t xml:space="preserve">It works across 3 distinct layers:
-1. Ingestion &amp; Extraction Layer: Reads raw binary bytes in milliseconds and extracts structured headers (Who called? What codecs were negotiated?).
-2. Diagnostic &amp; Reasoning Layer: Evaluates transactions against 3GPP carrier health rules (503 overloads, 487 timeouts, response latency).
-3. Plain-English Translation Layer: Synthesizes technical transactions into high-level Crux stories and engineering fixes.</w:t>
+              <w:t xml:space="preserve">It works across 3 distinct layers:</w:t>
+            </w:r>
+          </w:p>
+          <w:p>
+            <w:pPr>
+              <w:spacing w:after="60" w:line="276"/>
+            </w:pPr>
+            <w:r>
+              <w:rPr>
+                <w:rFonts w:ascii="Calibri" w:cs="Calibri" w:eastAsia="Calibri" w:hAnsi="Calibri"/>
+                <w:i w:val="false"/>
+                <w:iCs w:val="false"/>
+                <w:color w:val="1E293B"/>
+                <w:sz w:val="21"/>
+                <w:szCs w:val="21"/>
+              </w:rPr>
+              <w:t xml:space="preserve">1. Ingestion &amp; Extraction Layer: Reads raw binary bytes in milliseconds and extracts structured headers (Who called? What codecs were negotiated?).</w:t>
+            </w:r>
+          </w:p>
+          <w:p>
+            <w:pPr>
+              <w:spacing w:after="60" w:line="276"/>
+            </w:pPr>
+            <w:r>
+              <w:rPr>
+                <w:rFonts w:ascii="Calibri" w:cs="Calibri" w:eastAsia="Calibri" w:hAnsi="Calibri"/>
+                <w:i w:val="false"/>
+                <w:iCs w:val="false"/>
+                <w:color w:val="1E293B"/>
+                <w:sz w:val="21"/>
+                <w:szCs w:val="21"/>
+              </w:rPr>
+              <w:t xml:space="preserve">2. Diagnostic &amp; Reasoning Layer: Evaluates transactions against 3GPP carrier health rules (503 overloads, 487 timeouts, response latency).</w:t>
+            </w:r>
+          </w:p>
+          <w:p>
+            <w:pPr>
+              <w:spacing w:after="60" w:line="276"/>
+            </w:pPr>
+            <w:r>
+              <w:rPr>
+                <w:rFonts w:ascii="Calibri" w:cs="Calibri" w:eastAsia="Calibri" w:hAnsi="Calibri"/>
+                <w:i w:val="false"/>
+                <w:iCs w:val="false"/>
+                <w:color w:val="1E293B"/>
+                <w:sz w:val="21"/>
+                <w:szCs w:val="21"/>
+              </w:rPr>
+              <w:t xml:space="preserve">3. Plain-English Translation Layer: Synthesizes technical transactions into high-level Crux stories and engineering fixes.</w:t>
             </w:r>
           </w:p>
         </w:tc>
@@ -1621,12 +1884,12 @@
     </w:tbl>
     <w:p>
       <w:pPr>
-        <w:spacing w:after="120"/>
-      </w:pPr>
-    </w:p>
-    <w:p>
-      <w:pPr>
-        <w:spacing w:after="100" w:before="280"/>
+        <w:spacing w:after="100"/>
+      </w:pPr>
+    </w:p>
+    <w:p>
+      <w:pPr>
+        <w:spacing w:after="100" w:before="260"/>
       </w:pPr>
       <w:r>
         <w:rPr>
@@ -1671,15 +1934,15 @@
           <w:tcPr>
             <w:shd w:fill="F0FDF4" w:val="clear"/>
             <w:tcMar>
-              <w:top w:type="dxa" w:w="160"/>
-              <w:left w:type="dxa" w:w="200"/>
-              <w:bottom w:type="dxa" w:w="160"/>
-              <w:right w:type="dxa" w:w="180"/>
+              <w:top w:type="dxa" w:w="140"/>
+              <w:left w:type="dxa" w:w="180"/>
+              <w:bottom w:type="dxa" w:w="140"/>
+              <w:right w:type="dxa" w:w="160"/>
             </w:tcMar>
           </w:tcPr>
           <w:p>
             <w:pPr>
-              <w:spacing w:after="100"/>
+              <w:spacing w:after="80"/>
             </w:pPr>
             <w:r>
               <w:rPr>
@@ -1690,12 +1953,12 @@
                 <w:sz w:val="22"/>
                 <w:szCs w:val="22"/>
               </w:rPr>
-              <w:t xml:space="preserve">🗣️ Layman Answer (For Managers &amp; Leadership):</w:t>
-            </w:r>
-          </w:p>
-          <w:p>
-            <w:pPr>
-              <w:spacing w:after="80" w:line="276"/>
+              <w:t xml:space="preserve">🗣️ Recommended Layman Answer:</w:t>
+            </w:r>
+          </w:p>
+          <w:p>
+            <w:pPr>
+              <w:spacing w:after="60" w:line="276"/>
             </w:pPr>
             <w:r>
               <w:rPr>
@@ -1706,7 +1969,39 @@
                 <w:sz w:val="21"/>
                 <w:szCs w:val="21"/>
               </w:rPr>
-              <w:t xml:space="preserve">Through Deterministic Grounding: The calling phone number (+57 322...), Call-IDs, and audio ports are parsed directly from the binary byte stream by our parser first. Anomaly detection triggers only when verified numeric response codes exist in the capture index. The AI is strictly constrained to explain only verified packet facts.</w:t>
+              <w:t xml:space="preserve">Through Deterministic Grounding: The calling phone number (+57 322...), Call-IDs, and audio ports are parsed directly from the binary byte stream by our parser first.</w:t>
+            </w:r>
+          </w:p>
+          <w:p>
+            <w:pPr>
+              <w:spacing w:after="60" w:line="276"/>
+            </w:pPr>
+            <w:r>
+              <w:rPr>
+                <w:rFonts w:ascii="Calibri" w:cs="Calibri" w:eastAsia="Calibri" w:hAnsi="Calibri"/>
+                <w:i w:val="false"/>
+                <w:iCs w:val="false"/>
+                <w:color w:val="1E293B"/>
+                <w:sz w:val="21"/>
+                <w:szCs w:val="21"/>
+              </w:rPr>
+              <w:t xml:space="preserve">Anomaly detection triggers only when verified numeric response codes exist in the capture index.</w:t>
+            </w:r>
+          </w:p>
+          <w:p>
+            <w:pPr>
+              <w:spacing w:after="60" w:line="276"/>
+            </w:pPr>
+            <w:r>
+              <w:rPr>
+                <w:rFonts w:ascii="Calibri" w:cs="Calibri" w:eastAsia="Calibri" w:hAnsi="Calibri"/>
+                <w:i w:val="false"/>
+                <w:iCs w:val="false"/>
+                <w:color w:val="1E293B"/>
+                <w:sz w:val="21"/>
+                <w:szCs w:val="21"/>
+              </w:rPr>
+              <w:t xml:space="preserve">The AI is strictly constrained to explain only verified packet facts.</w:t>
             </w:r>
           </w:p>
         </w:tc>
@@ -1714,12 +2009,12 @@
     </w:tbl>
     <w:p>
       <w:pPr>
-        <w:spacing w:after="120"/>
-      </w:pPr>
-    </w:p>
-    <w:p>
-      <w:pPr>
-        <w:spacing w:after="100" w:before="280"/>
+        <w:spacing w:after="100"/>
+      </w:pPr>
+    </w:p>
+    <w:p>
+      <w:pPr>
+        <w:spacing w:after="100" w:before="260"/>
       </w:pPr>
       <w:r>
         <w:rPr>
@@ -1764,15 +2059,15 @@
           <w:tcPr>
             <w:shd w:fill="F0FDF4" w:val="clear"/>
             <w:tcMar>
-              <w:top w:type="dxa" w:w="160"/>
-              <w:left w:type="dxa" w:w="200"/>
-              <w:bottom w:type="dxa" w:w="160"/>
-              <w:right w:type="dxa" w:w="180"/>
+              <w:top w:type="dxa" w:w="140"/>
+              <w:left w:type="dxa" w:w="180"/>
+              <w:bottom w:type="dxa" w:w="140"/>
+              <w:right w:type="dxa" w:w="160"/>
             </w:tcMar>
           </w:tcPr>
           <w:p>
             <w:pPr>
-              <w:spacing w:after="100"/>
+              <w:spacing w:after="80"/>
             </w:pPr>
             <w:r>
               <w:rPr>
@@ -1783,12 +2078,12 @@
                 <w:sz w:val="22"/>
                 <w:szCs w:val="22"/>
               </w:rPr>
-              <w:t xml:space="preserve">🗣️ Layman Answer (For Managers &amp; Leadership):</w:t>
-            </w:r>
-          </w:p>
-          <w:p>
-            <w:pPr>
-              <w:spacing w:after="80" w:line="276"/>
+              <w:t xml:space="preserve">🗣️ Recommended Layman Answer:</w:t>
+            </w:r>
+          </w:p>
+          <w:p>
+            <w:pPr>
+              <w:spacing w:after="60" w:line="276"/>
             </w:pPr>
             <w:r>
               <w:rPr>
@@ -1807,12 +2102,12 @@
     </w:tbl>
     <w:p>
       <w:pPr>
-        <w:spacing w:after="120"/>
-      </w:pPr>
-    </w:p>
-    <w:p>
-      <w:pPr>
-        <w:spacing w:after="100" w:before="280"/>
+        <w:spacing w:after="100"/>
+      </w:pPr>
+    </w:p>
+    <w:p>
+      <w:pPr>
+        <w:spacing w:after="100" w:before="260"/>
       </w:pPr>
       <w:r>
         <w:rPr>
@@ -1857,15 +2152,15 @@
           <w:tcPr>
             <w:shd w:fill="F0FDF4" w:val="clear"/>
             <w:tcMar>
-              <w:top w:type="dxa" w:w="160"/>
-              <w:left w:type="dxa" w:w="200"/>
-              <w:bottom w:type="dxa" w:w="160"/>
-              <w:right w:type="dxa" w:w="180"/>
+              <w:top w:type="dxa" w:w="140"/>
+              <w:left w:type="dxa" w:w="180"/>
+              <w:bottom w:type="dxa" w:w="140"/>
+              <w:right w:type="dxa" w:w="160"/>
             </w:tcMar>
           </w:tcPr>
           <w:p>
             <w:pPr>
-              <w:spacing w:after="100"/>
+              <w:spacing w:after="80"/>
             </w:pPr>
             <w:r>
               <w:rPr>
@@ -1876,12 +2171,12 @@
                 <w:sz w:val="22"/>
                 <w:szCs w:val="22"/>
               </w:rPr>
-              <w:t xml:space="preserve">🗣️ Layman Answer (For Managers &amp; Leadership):</w:t>
-            </w:r>
-          </w:p>
-          <w:p>
-            <w:pPr>
-              <w:spacing w:after="80" w:line="276"/>
+              <w:t xml:space="preserve">🗣️ Recommended Layman Answer:</w:t>
+            </w:r>
+          </w:p>
+          <w:p>
+            <w:pPr>
+              <w:spacing w:after="60" w:line="276"/>
             </w:pPr>
             <w:r>
               <w:rPr>
@@ -1900,12 +2195,12 @@
     </w:tbl>
     <w:p>
       <w:pPr>
-        <w:spacing w:after="120"/>
-      </w:pPr>
-    </w:p>
-    <w:p>
-      <w:pPr>
-        <w:spacing w:after="100" w:before="280"/>
+        <w:spacing w:after="100"/>
+      </w:pPr>
+    </w:p>
+    <w:p>
+      <w:pPr>
+        <w:spacing w:after="100" w:before="260"/>
       </w:pPr>
       <w:r>
         <w:rPr>
@@ -1950,15 +2245,15 @@
           <w:tcPr>
             <w:shd w:fill="F0FDF4" w:val="clear"/>
             <w:tcMar>
-              <w:top w:type="dxa" w:w="160"/>
-              <w:left w:type="dxa" w:w="200"/>
-              <w:bottom w:type="dxa" w:w="160"/>
-              <w:right w:type="dxa" w:w="180"/>
+              <w:top w:type="dxa" w:w="140"/>
+              <w:left w:type="dxa" w:w="180"/>
+              <w:bottom w:type="dxa" w:w="140"/>
+              <w:right w:type="dxa" w:w="160"/>
             </w:tcMar>
           </w:tcPr>
           <w:p>
             <w:pPr>
-              <w:spacing w:after="100"/>
+              <w:spacing w:after="80"/>
             </w:pPr>
             <w:r>
               <w:rPr>
@@ -1969,12 +2264,12 @@
                 <w:sz w:val="22"/>
                 <w:szCs w:val="22"/>
               </w:rPr>
-              <w:t xml:space="preserve">🗣️ Layman Answer (For Managers &amp; Leadership):</w:t>
-            </w:r>
-          </w:p>
-          <w:p>
-            <w:pPr>
-              <w:spacing w:after="80" w:line="276"/>
+              <w:t xml:space="preserve">🗣️ Recommended Layman Answer:</w:t>
+            </w:r>
+          </w:p>
+          <w:p>
+            <w:pPr>
+              <w:spacing w:after="60" w:line="276"/>
             </w:pPr>
             <w:r>
               <w:rPr>
@@ -1993,13 +2288,13 @@
     </w:tbl>
     <w:p>
       <w:pPr>
-        <w:spacing w:after="120"/>
+        <w:spacing w:after="100"/>
       </w:pPr>
     </w:p>
     <w:p>
       <w:pPr>
         <w:pStyle w:val="Heading1"/>
-        <w:spacing w:after="140" w:before="360"/>
+        <w:spacing w:after="120" w:before="320"/>
       </w:pPr>
       <w:r>
         <w:rPr>
@@ -2135,7 +2430,7 @@
     </w:p>
     <w:sectPr>
       <w:pgSz w:w="11906" w:h="16838" w:orient="portrait"/>
-      <w:pgMar w:top="1000" w:right="1000" w:bottom="1000" w:left="1000" w:header="708" w:footer="708" w:gutter="0"/>
+      <w:pgMar w:top="900" w:right="900" w:bottom="900" w:left="900" w:header="708" w:footer="708" w:gutter="0"/>
       <w:pgNumType/>
       <w:docGrid w:linePitch="360"/>
     </w:sectPr>

</xml_diff>